<commit_message>
feat: add formal training proposal and technical specifications document for AI courses
</commit_message>
<xml_diff>
--- a/00-Formation/Proposition_Formation_IA_CahierDesCharges.docx
+++ b/00-Formation/Proposition_Formation_IA_CahierDesCharges.docx
@@ -104,7 +104,7 @@
           <w:sz w:val="22"/>
           <w:szCs w:val="22"/>
         </w:rPr>
-        <w:t xml:space="preserve">Proposition d’animation et cahier des charges ressources</w:t>
+        <w:t xml:space="preserve">Proposition d'animation et cahier des charges ressources</w:t>
       </w:r>
     </w:p>
     <w:p>
@@ -382,7 +382,7 @@
                 <w:sz w:val="18"/>
                 <w:szCs w:val="18"/>
               </w:rPr>
-              <w:t xml:space="preserve">Proposition d’animation + Cahier des charges ressources IA</w:t>
+              <w:t xml:space="preserve">Proposition d'animation + Cahier des charges ressources IA</w:t>
             </w:r>
           </w:p>
         </w:tc>
@@ -416,7 +416,7 @@
           <w:sz w:val="24"/>
           <w:szCs w:val="24"/>
         </w:rPr>
-        <w:t xml:space="preserve">  PARTIE 1 – PROPOSITION D’ANIMATION DE LA FORMATION</w:t>
+        <w:t xml:space="preserve">  PARTIE 1 – PROPOSITION D'ANIMATION DE LA FORMATION</w:t>
       </w:r>
     </w:p>
     <w:p>
@@ -437,7 +437,7 @@
           <w:sz w:val="20"/>
           <w:szCs w:val="20"/>
         </w:rPr>
-        <w:t xml:space="preserve">La formation Intelligence Artificielle référencée au catalogue AFPI est construite sur 2 jours (14 heures effectives). Elle répond directement au programme publié sur le site du Pôle Formation et s’appuie sur un corpus de ressources pédagogiques déjà constitué : supports HTML interactifs, ateliers guidés, guides formateur, activités métier.</w:t>
+        <w:t xml:space="preserve">La formation Intelligence Artificielle référencée au catalogue AFPI est construite sur 2 jours (14 heures effectives). Elle répond directement au programme publié sur le site du Pôle Formation et s'appuie sur un corpus de ressources pédagogiques déjà constitué : supports HTML interactifs, ateliers guidés, guides formateur, activités métier.</w:t>
       </w:r>
     </w:p>
     <w:p>
@@ -450,7 +450,7 @@
           <w:sz w:val="20"/>
           <w:szCs w:val="20"/>
         </w:rPr>
-        <w:t xml:space="preserve">Le public cible est mixte : salariés de l’industrie toutes fonctions confondues (techniciens de maintenance, agents de production, fonctions administratives, commerciaux, RH, managers). Aucun prérequis technique n’est exigé.</w:t>
+        <w:t xml:space="preserve">Le public cible est mixte : salariés de l'industrie toutes fonctions confondues (techniciens de maintenance, agents de production, fonctions administratives, commerciaux, RH, managers). Aucun prérequis technique n'est exigé.</w:t>
       </w:r>
     </w:p>
     <w:p>
@@ -474,7 +474,7 @@
           <w:sz w:val="22"/>
           <w:szCs w:val="22"/>
         </w:rPr>
-        <w:t xml:space="preserve">Vue d’ensemble des 2 jours</w:t>
+        <w:t xml:space="preserve">Vue d'ensemble des 2 jours</w:t>
       </w:r>
     </w:p>
     <w:tbl>
@@ -747,7 +747,7 @@
                 <w:sz w:val="18"/>
                 <w:szCs w:val="18"/>
               </w:rPr>
-              <w:t xml:space="preserve">NotebookLM (Google) + LLM au choix (Gemini / ChatGPT) + démonstrations formateur</w:t>
+              <w:t xml:space="preserve">NotebookLM (Google) + Gemini, Claude, Antigravity – démonstrations formateur</w:t>
             </w:r>
           </w:p>
         </w:tc>
@@ -939,7 +939,7 @@
                 <w:sz w:val="18"/>
                 <w:szCs w:val="18"/>
               </w:rPr>
-              <w:t xml:space="preserve">Participative et démonstrative – alternance théorie / pratique (40 % / 60 %)</w:t>
+              <w:t xml:space="preserve">Participative et démonstrative – alternance théorie / pratique (40 % / 60 %)</w:t>
             </w:r>
           </w:p>
         </w:tc>
@@ -968,7 +968,7 @@
           <w:sz w:val="24"/>
           <w:szCs w:val="24"/>
         </w:rPr>
-        <w:t xml:space="preserve">  JOUR 1 – Comprendre et Explorer l’IA (7 heures)</w:t>
+        <w:t xml:space="preserve">  JOUR 1 – Comprendre et Explorer l'IA (7 heures)</w:t>
       </w:r>
     </w:p>
     <w:p>
@@ -995,7 +995,7 @@
           <w:sz w:val="22"/>
           <w:szCs w:val="22"/>
         </w:rPr>
-        <w:t xml:space="preserve">Module 1 – Comprendre les fondamentaux de l’IA (1h30)</w:t>
+        <w:t xml:space="preserve">Module 1 – Comprendre les fondamentaux de l'IA (1h30)</w:t>
       </w:r>
     </w:p>
     <w:p>
@@ -1008,7 +1008,7 @@
           <w:sz w:val="20"/>
           <w:szCs w:val="20"/>
         </w:rPr>
-        <w:t xml:space="preserve">Démystifier l’IA, distinguer les concepts clés, replacer les outils actuels dans leur contexte historique.</w:t>
+        <w:t xml:space="preserve">Démystifier l'IA, distinguer les concepts clés, replacer les outils actuels dans leur contexte historique.</w:t>
       </w:r>
     </w:p>
     <w:tbl>
@@ -1185,7 +1185,7 @@
                 <w:sz w:val="18"/>
                 <w:szCs w:val="18"/>
               </w:rPr>
-              <w:t xml:space="preserve">Tour de table, représentations initiales, brise-glace « Qu’est-ce que l’IA pour vous ? »</w:t>
+              <w:t xml:space="preserve">Tour de table, représentations initiales, brise-glace « Qu'est-ce que l'IA pour vous ? »</w:t>
             </w:r>
           </w:p>
         </w:tc>
@@ -1375,7 +1375,7 @@
                 <w:sz w:val="18"/>
                 <w:szCs w:val="18"/>
               </w:rPr>
-              <w:t xml:space="preserve">Étude de cas papier : identification de features biaisées dans un jeu de données. Découverte du biais en amont de l’IA.</w:t>
+              <w:t xml:space="preserve">Étude de cas papier : identification de features biaisées dans un jeu de données. Découverte du biais en amont de l'IA.</w:t>
             </w:r>
           </w:p>
         </w:tc>
@@ -1544,7 +1544,7 @@
           <w:sz w:val="20"/>
           <w:szCs w:val="20"/>
         </w:rPr>
-        <w:t xml:space="preserve">Comprendre le fonctionnement d’un LLM, prendre en main un outil génératif, découvrir l’écosystème.</w:t>
+        <w:t xml:space="preserve">Comprendre le fonctionnement d'un LLM, prendre en main un outil génératif, découvrir l'écosystème.</w:t>
       </w:r>
     </w:p>
     <w:tbl>
@@ -1721,7 +1721,7 @@
                 <w:sz w:val="18"/>
                 <w:szCs w:val="18"/>
               </w:rPr>
-              <w:t xml:space="preserve">Tokens, fenêtre de contexte, température, hallucination, RAG – les 5 concepts clés du Top 10 %</w:t>
+              <w:t xml:space="preserve">Tokens, fenêtre de contexte, température, hallucination, RAG – les 5 concepts clés du Top 10 %</w:t>
             </w:r>
           </w:p>
         </w:tc>
@@ -1816,7 +1816,7 @@
                 <w:sz w:val="18"/>
                 <w:szCs w:val="18"/>
               </w:rPr>
-              <w:t xml:space="preserve">ChatGPT, Gemini, Claude, Copilot, DALL-E, Midjourney, ElevenLabs… selon les métiers</w:t>
+              <w:t xml:space="preserve">Gemini, Claude, Copilot, Mistral, DALL-E, Midjourney, ElevenLabs… selon les métiers – positionnement de chaque famille d'outils</w:t>
             </w:r>
           </w:p>
         </w:tc>
@@ -1911,7 +1911,7 @@
                 <w:sz w:val="18"/>
                 <w:szCs w:val="18"/>
               </w:rPr>
-              <w:t xml:space="preserve">Connexion sur Gemini ou ChatGPT, comparaison avec/sans contexte, test de l’hallucination, réglage température</w:t>
+              <w:t xml:space="preserve">Connexion sur Gemini ou Claude, comparaison avec/sans contexte, test de l'hallucination, réglage température – démonstration Antigravity en complément</w:t>
             </w:r>
           </w:p>
         </w:tc>
@@ -1985,7 +1985,7 @@
           <w:sz w:val="20"/>
           <w:szCs w:val="20"/>
         </w:rPr>
-        <w:t xml:space="preserve">S’approprier les techniques de prompting, de la structure de base aux techniques avancées.</w:t>
+        <w:t xml:space="preserve">S'approprier les techniques de prompting, de la structure de base aux techniques avancées.</w:t>
       </w:r>
     </w:p>
     <w:tbl>
@@ -2131,7 +2131,7 @@
                 <w:sz w:val="18"/>
                 <w:szCs w:val="18"/>
               </w:rPr>
-              <w:t xml:space="preserve">Anatomie d’un prompt</w:t>
+              <w:t xml:space="preserve">Anatomie d'un prompt</w:t>
             </w:r>
           </w:p>
         </w:tc>
@@ -2257,7 +2257,7 @@
                 <w:sz w:val="18"/>
                 <w:szCs w:val="18"/>
               </w:rPr>
-              <w:t xml:space="preserve">Exercices d’identification et construction de prompts – support interactif HTML</w:t>
+              <w:t xml:space="preserve">Exercices d'identification et construction de prompts – support interactif HTML</w:t>
             </w:r>
           </w:p>
         </w:tc>
@@ -2447,7 +2447,7 @@
                 <w:sz w:val="18"/>
                 <w:szCs w:val="18"/>
               </w:rPr>
-              <w:t xml:space="preserve">Chaque binôme choisit un outil IA, prépare et présente en 5 min : fonctionnement, démo, cas métier, limite principale</w:t>
+              <w:t xml:space="preserve">Chaque binôme choisit un outil IA (Gemini, Claude ou Antigravity), prépare et présente en 5 min : fonctionnement, démo, cas métier, limite principale</w:t>
             </w:r>
           </w:p>
         </w:tc>
@@ -2507,7 +2507,7 @@
           <w:sz w:val="24"/>
           <w:szCs w:val="24"/>
         </w:rPr>
-        <w:t xml:space="preserve">  JOUR 2 – Identifier les limites et intégrer l’IA (7 heures)</w:t>
+        <w:t xml:space="preserve">  JOUR 2 – Identifier les limites et intégrer l'IA (7 heures)</w:t>
       </w:r>
     </w:p>
     <w:p>
@@ -2534,7 +2534,7 @@
           <w:sz w:val="22"/>
           <w:szCs w:val="22"/>
         </w:rPr>
-        <w:t xml:space="preserve">Module 4 (partie 1) – Limites et pièges de l’IA (1h30)</w:t>
+        <w:t xml:space="preserve">Module 4 (partie 1) – Limites et pièges de l'IA (1h30)</w:t>
       </w:r>
     </w:p>
     <w:tbl>
@@ -2711,7 +2711,7 @@
                 <w:sz w:val="18"/>
                 <w:szCs w:val="18"/>
               </w:rPr>
-              <w:t xml:space="preserve">Anatomie des biais algorithmiques, mécanismes de l’hallucination, limites techniques (knowledge cutoff, mémoire), enjeux RGPD et IA Act européen</w:t>
+              <w:t xml:space="preserve">Anatomie des biais algorithmiques, mécanismes de l'hallucination, limites techniques (knowledge cutoff, mémoire), enjeux RGPD et IA Act européen</w:t>
             </w:r>
           </w:p>
         </w:tc>
@@ -3662,7 +3662,7 @@
                 <w:sz w:val="18"/>
                 <w:szCs w:val="18"/>
               </w:rPr>
-              <w:t xml:space="preserve">Chaque participant formule et teste un prompt sur son propre contexte professionnel, itération collective</w:t>
+              <w:t xml:space="preserve">Chaque participant formule et teste un prompt sur son propre contexte professionnel (via Gemini ou Claude), itération collective</w:t>
             </w:r>
           </w:p>
         </w:tc>
@@ -3925,7 +3925,7 @@
                 <w:sz w:val="18"/>
                 <w:szCs w:val="18"/>
               </w:rPr>
-              <w:t xml:space="preserve">Point d’attention clé : les participants doivent être informés AVANT la formation d’apporter un document professionnel (procédure, notice, rapport, référentiel) pour l’atelier NotebookLM du Jour 2. Ce document reste confidentiel et n’est utilisé que sur leur propre poste.</w:t>
+              <w:t xml:space="preserve">Point d'attention clé : les participants doivent être informés AVANT la formation d'apporter un document professionnel (procédure, notice, rapport, référentiel) pour l'atelier NotebookLM du Jour 2. Ce document reste confidentiel et n'est utilisé que sur leur propre poste.</w:t>
             </w:r>
           </w:p>
         </w:tc>
@@ -3980,7 +3980,7 @@
           <w:sz w:val="20"/>
           <w:szCs w:val="20"/>
         </w:rPr>
-        <w:t xml:space="preserve">Animer une formation sur l’Intelligence Artificielle sans accès à des outils IA performants est incohérent avec le contenu enseigné. Le formateur doit démontrer en direct, et les stagiaires doivent pratiquer. Cette partie détaille les ressources nécessaires selon deux scénarios : solution cloud (payante) et solution locale (open source).</w:t>
+        <w:t xml:space="preserve">Animer une formation sur l'Intelligence Artificielle sans accès à des outils IA performants est incohérent avec le contenu enseigné. Le formateur doit démontrer en direct, et les stagiaires doivent pratiquer. Cette partie détaille les ressources nécessaires selon deux scénarios : solution cloud (payante) et solution locale (open source).</w:t>
       </w:r>
     </w:p>
     <w:p>
@@ -5237,7 +5237,7 @@
           <w:sz w:val="20"/>
           <w:szCs w:val="20"/>
         </w:rPr>
-        <w:t xml:space="preserve">Le formateur doit disposer d’un accès premium pour les démonstrations en direct. Un compte gratuit est insuffisant : limites de contexte, throttling, indisponibilité en période de charge.</w:t>
+        <w:t xml:space="preserve">Le formateur doit disposer d'un accès premium pour les démonstrations en direct. Un compte gratuit est insuffisant : limites de contexte, throttling, indisponibilité en période de charge.</w:t>
       </w:r>
     </w:p>
     <w:p>
@@ -5485,7 +5485,7 @@
                 <w:sz w:val="18"/>
                 <w:szCs w:val="18"/>
               </w:rPr>
-              <w:t xml:space="preserve">Fenêtre de contexte 200 000 tokens, accès Claude Sonnet et Opus, débit stable en journée de formation</w:t>
+              <w:t xml:space="preserve">Fenêtre de contexte 200 000 tokens, accès Claude Sonnet et Opus, débit stable en journée de formation</w:t>
             </w:r>
           </w:p>
         </w:tc>
@@ -5549,7 +5549,7 @@
                 <w:sz w:val="18"/>
                 <w:szCs w:val="18"/>
               </w:rPr>
-              <w:t xml:space="preserve">ChatGPT Plus (OpenAI)</w:t>
+              <w:t xml:space="preserve">Gemini Advanced (Google)</w:t>
             </w:r>
           </w:p>
         </w:tc>
@@ -5611,7 +5611,7 @@
                 <w:sz w:val="18"/>
                 <w:szCs w:val="18"/>
               </w:rPr>
-              <w:t xml:space="preserve">Accès GPT-4o, génération d’images DALL-E, code interpreter, outil le plus connu du public</w:t>
+              <w:t xml:space="preserve">Intégration Google Workspace native, pertinent si parc Google existant – inclut Google One AI Premium (NotebookLM compris)</w:t>
             </w:r>
           </w:p>
         </w:tc>
@@ -5636,13 +5636,13 @@
             <w:r>
               <w:rPr>
                 <w:rFonts w:ascii="Arial" w:cs="Arial" w:eastAsia="Arial" w:hAnsi="Arial"/>
-                <w:b w:val="false"/>
-                <w:bCs w:val="false"/>
-                <w:color w:val="000000"/>
-                <w:sz w:val="18"/>
-                <w:szCs w:val="18"/>
-              </w:rPr>
-              <w:t xml:space="preserve">Complément utile</w:t>
+                <w:b/>
+                <w:bCs/>
+                <w:color w:val="375623"/>
+                <w:sz w:val="18"/>
+                <w:szCs w:val="18"/>
+              </w:rPr>
+              <w:t xml:space="preserve">Recommandé formateur</w:t>
             </w:r>
           </w:p>
         </w:tc>
@@ -5675,7 +5675,7 @@
                 <w:sz w:val="18"/>
                 <w:szCs w:val="18"/>
               </w:rPr>
-              <w:t xml:space="preserve">Gemini Advanced (Google)</w:t>
+              <w:t xml:space="preserve">Copilot Pro (Microsoft)</w:t>
             </w:r>
           </w:p>
         </w:tc>
@@ -5737,7 +5737,7 @@
                 <w:sz w:val="18"/>
                 <w:szCs w:val="18"/>
               </w:rPr>
-              <w:t xml:space="preserve">Intégration Google Workspace native, pertinent si parc Google existant, NotebookLM inclus dans Google One AI Premium</w:t>
+              <w:t xml:space="preserve">Intégration Office 365, pertinent si parc Microsoft en salle</w:t>
             </w:r>
           </w:p>
         </w:tc>
@@ -5751,132 +5751,6 @@
               <w:right w:val="single" w:color="CCCCCC" w:sz="1"/>
             </w:tcBorders>
             <w:shd w:fill="F2F2F2" w:val="clear"/>
-            <w:tcMar>
-              <w:top w:type="dxa" w:w="60"/>
-              <w:left w:type="dxa" w:w="100"/>
-              <w:bottom w:type="dxa" w:w="60"/>
-              <w:right w:type="dxa" w:w="100"/>
-            </w:tcMar>
-          </w:tcPr>
-          <w:p>
-            <w:r>
-              <w:rPr>
-                <w:rFonts w:ascii="Arial" w:cs="Arial" w:eastAsia="Arial" w:hAnsi="Arial"/>
-                <w:b w:val="false"/>
-                <w:bCs w:val="false"/>
-                <w:color w:val="000000"/>
-                <w:sz w:val="18"/>
-                <w:szCs w:val="18"/>
-              </w:rPr>
-              <w:t xml:space="preserve">Complément utile</w:t>
-            </w:r>
-          </w:p>
-        </w:tc>
-      </w:tr>
-      <w:tr>
-        <w:tc>
-          <w:tcPr>
-            <w:tcW w:type="dxa" w:w="2000"/>
-            <w:tcBorders>
-              <w:top w:val="single" w:color="CCCCCC" w:sz="1"/>
-              <w:left w:val="single" w:color="CCCCCC" w:sz="1"/>
-              <w:bottom w:val="single" w:color="CCCCCC" w:sz="1"/>
-              <w:right w:val="single" w:color="CCCCCC" w:sz="1"/>
-            </w:tcBorders>
-            <w:shd w:fill="FFFFFF" w:val="clear"/>
-            <w:tcMar>
-              <w:top w:type="dxa" w:w="60"/>
-              <w:left w:type="dxa" w:w="100"/>
-              <w:bottom w:type="dxa" w:w="60"/>
-              <w:right w:type="dxa" w:w="100"/>
-            </w:tcMar>
-          </w:tcPr>
-          <w:p>
-            <w:r>
-              <w:rPr>
-                <w:rFonts w:ascii="Arial" w:cs="Arial" w:eastAsia="Arial" w:hAnsi="Arial"/>
-                <w:b w:val="false"/>
-                <w:bCs w:val="false"/>
-                <w:color w:val="000000"/>
-                <w:sz w:val="18"/>
-                <w:szCs w:val="18"/>
-              </w:rPr>
-              <w:t xml:space="preserve">Copilot Pro (Microsoft)</w:t>
-            </w:r>
-          </w:p>
-        </w:tc>
-        <w:tc>
-          <w:tcPr>
-            <w:tcW w:type="dxa" w:w="1600"/>
-            <w:tcBorders>
-              <w:top w:val="single" w:color="CCCCCC" w:sz="1"/>
-              <w:left w:val="single" w:color="CCCCCC" w:sz="1"/>
-              <w:bottom w:val="single" w:color="CCCCCC" w:sz="1"/>
-              <w:right w:val="single" w:color="CCCCCC" w:sz="1"/>
-            </w:tcBorders>
-            <w:shd w:fill="FFFFFF" w:val="clear"/>
-            <w:tcMar>
-              <w:top w:type="dxa" w:w="60"/>
-              <w:left w:type="dxa" w:w="100"/>
-              <w:bottom w:type="dxa" w:w="60"/>
-              <w:right w:type="dxa" w:w="100"/>
-            </w:tcMar>
-          </w:tcPr>
-          <w:p>
-            <w:r>
-              <w:rPr>
-                <w:rFonts w:ascii="Arial" w:cs="Arial" w:eastAsia="Arial" w:hAnsi="Arial"/>
-                <w:b w:val="false"/>
-                <w:bCs w:val="false"/>
-                <w:color w:val="000000"/>
-                <w:sz w:val="18"/>
-                <w:szCs w:val="18"/>
-              </w:rPr>
-              <w:t xml:space="preserve">22 €/mois</w:t>
-            </w:r>
-          </w:p>
-        </w:tc>
-        <w:tc>
-          <w:tcPr>
-            <w:tcW w:type="dxa" w:w="3800"/>
-            <w:tcBorders>
-              <w:top w:val="single" w:color="CCCCCC" w:sz="1"/>
-              <w:left w:val="single" w:color="CCCCCC" w:sz="1"/>
-              <w:bottom w:val="single" w:color="CCCCCC" w:sz="1"/>
-              <w:right w:val="single" w:color="CCCCCC" w:sz="1"/>
-            </w:tcBorders>
-            <w:shd w:fill="FFFFFF" w:val="clear"/>
-            <w:tcMar>
-              <w:top w:type="dxa" w:w="60"/>
-              <w:left w:type="dxa" w:w="100"/>
-              <w:bottom w:type="dxa" w:w="60"/>
-              <w:right w:type="dxa" w:w="100"/>
-            </w:tcMar>
-          </w:tcPr>
-          <w:p>
-            <w:r>
-              <w:rPr>
-                <w:rFonts w:ascii="Arial" w:cs="Arial" w:eastAsia="Arial" w:hAnsi="Arial"/>
-                <w:b w:val="false"/>
-                <w:bCs w:val="false"/>
-                <w:color w:val="000000"/>
-                <w:sz w:val="18"/>
-                <w:szCs w:val="18"/>
-              </w:rPr>
-              <w:t xml:space="preserve">Intégration Office 365, pertinent si parc Microsoft en salle</w:t>
-            </w:r>
-          </w:p>
-        </w:tc>
-        <w:tc>
-          <w:tcPr>
-            <w:tcW w:type="dxa" w:w="1626"/>
-            <w:tcBorders>
-              <w:top w:val="single" w:color="CCCCCC" w:sz="1"/>
-              <w:left w:val="single" w:color="CCCCCC" w:sz="1"/>
-              <w:bottom w:val="single" w:color="CCCCCC" w:sz="1"/>
-              <w:right w:val="single" w:color="CCCCCC" w:sz="1"/>
-            </w:tcBorders>
-            <w:shd w:fill="FFFFFF" w:val="clear"/>
             <w:tcMar>
               <w:top w:type="dxa" w:w="60"/>
               <w:left w:type="dxa" w:w="100"/>
@@ -5950,7 +5824,7 @@
                 <w:sz w:val="18"/>
                 <w:szCs w:val="18"/>
               </w:rPr>
-              <w:t xml:space="preserve">Budget formateur minimum : 1 abonnement Claude Pro (20 €/mois) + 1 abonnement ChatGPT Plus (22 €/mois) pour couvrir les deux écosystèmes principaux en démonstration comparée. Soit 42 €/mois. NotebookLM reste gratuit avec un compte Google standard.</w:t>
+              <w:t xml:space="preserve">Budget formateur minimum : 1 abonnement Claude Pro (20 €/mois) + 1 abonnement Gemini Advanced (22 €/mois) pour couvrir les deux écosystèmes principaux en démonstration comparée. Soit 42 €/mois. NotebookLM reste gratuit avec un compte Google standard.</w:t>
             </w:r>
           </w:p>
         </w:tc>
@@ -5993,7 +5867,7 @@
           <w:sz w:val="20"/>
           <w:szCs w:val="20"/>
         </w:rPr>
-        <w:t xml:space="preserve">Trois niveaux d’équipement sont possibles selon le budget alloué par session :</w:t>
+        <w:t xml:space="preserve">Trois niveaux d'équipement sont possibles selon le budget alloué par session :</w:t>
       </w:r>
     </w:p>
     <w:p>
@@ -6210,7 +6084,7 @@
                 <w:sz w:val="18"/>
                 <w:szCs w:val="18"/>
               </w:rPr>
-              <w:t xml:space="preserve">ChatGPT Free ou Gemini Free. Suffisant pour les ateliers de base. Limite : quota de messages, modèle GPT-3.5 uniquement sur ChatGPT Free.</w:t>
+              <w:t xml:space="preserve">Gemini Free ou Claude Free (tier gratuit). Suffisant pour les ateliers de base. Limite : quota de messages journalier, modèle allégé sur le tier gratuit.</w:t>
             </w:r>
           </w:p>
         </w:tc>
@@ -6305,7 +6179,7 @@
                 <w:sz w:val="18"/>
                 <w:szCs w:val="18"/>
               </w:rPr>
-              <w:t xml:space="preserve">Option 2 – Licences temporaires OpenAI Education</w:t>
+              <w:t xml:space="preserve">Option 2 – Claude Teams (min. 5 users)</w:t>
             </w:r>
           </w:p>
         </w:tc>
@@ -6336,7 +6210,7 @@
                 <w:sz w:val="18"/>
                 <w:szCs w:val="18"/>
               </w:rPr>
-              <w:t xml:space="preserve">OpenAI propose des licences éducatives. Accès GPT-4o pour la durée de la formation. À négocier directement avec OpenAI Education.</w:t>
+              <w:t xml:space="preserve">25 €/user/mois. Accès Claude Sonnet, historique isolé, aucune réutilisation des données pour entraînement. Adapté si déploiement récurrent sur plusieurs sessions.</w:t>
             </w:r>
           </w:p>
         </w:tc>
@@ -6367,7 +6241,7 @@
                 <w:sz w:val="18"/>
                 <w:szCs w:val="18"/>
               </w:rPr>
-              <w:t xml:space="preserve">À négocier – estimation 5 €/jour/user</w:t>
+              <w:t xml:space="preserve">~ 300 €/mois pour 12 users</w:t>
             </w:r>
           </w:p>
         </w:tc>
@@ -6381,132 +6255,6 @@
               <w:right w:val="single" w:color="CCCCCC" w:sz="1"/>
             </w:tcBorders>
             <w:shd w:fill="FFFFFF" w:val="clear"/>
-            <w:tcMar>
-              <w:top w:type="dxa" w:w="60"/>
-              <w:left w:type="dxa" w:w="100"/>
-              <w:bottom w:type="dxa" w:w="60"/>
-              <w:right w:type="dxa" w:w="100"/>
-            </w:tcMar>
-          </w:tcPr>
-          <w:p>
-            <w:r>
-              <w:rPr>
-                <w:rFonts w:ascii="Arial" w:cs="Arial" w:eastAsia="Arial" w:hAnsi="Arial"/>
-                <w:b/>
-                <w:bCs/>
-                <w:color w:val="000000"/>
-                <w:sz w:val="18"/>
-                <w:szCs w:val="18"/>
-              </w:rPr>
-              <w:t xml:space="preserve">Bonne</w:t>
-            </w:r>
-          </w:p>
-        </w:tc>
-      </w:tr>
-      <w:tr>
-        <w:tc>
-          <w:tcPr>
-            <w:tcW w:type="dxa" w:w="2200"/>
-            <w:tcBorders>
-              <w:top w:val="single" w:color="CCCCCC" w:sz="1"/>
-              <w:left w:val="single" w:color="CCCCCC" w:sz="1"/>
-              <w:bottom w:val="single" w:color="CCCCCC" w:sz="1"/>
-              <w:right w:val="single" w:color="CCCCCC" w:sz="1"/>
-            </w:tcBorders>
-            <w:shd w:fill="F2F2F2" w:val="clear"/>
-            <w:tcMar>
-              <w:top w:type="dxa" w:w="60"/>
-              <w:left w:type="dxa" w:w="100"/>
-              <w:bottom w:type="dxa" w:w="60"/>
-              <w:right w:type="dxa" w:w="100"/>
-            </w:tcMar>
-          </w:tcPr>
-          <w:p>
-            <w:r>
-              <w:rPr>
-                <w:rFonts w:ascii="Arial" w:cs="Arial" w:eastAsia="Arial" w:hAnsi="Arial"/>
-                <w:b/>
-                <w:bCs/>
-                <w:color w:val="000000"/>
-                <w:sz w:val="18"/>
-                <w:szCs w:val="18"/>
-              </w:rPr>
-              <w:t xml:space="preserve">Option 3 – ChatGPT Team (min. 2 users)</w:t>
-            </w:r>
-          </w:p>
-        </w:tc>
-        <w:tc>
-          <w:tcPr>
-            <w:tcW w:type="dxa" w:w="3400"/>
-            <w:tcBorders>
-              <w:top w:val="single" w:color="CCCCCC" w:sz="1"/>
-              <w:left w:val="single" w:color="CCCCCC" w:sz="1"/>
-              <w:bottom w:val="single" w:color="CCCCCC" w:sz="1"/>
-              <w:right w:val="single" w:color="CCCCCC" w:sz="1"/>
-            </w:tcBorders>
-            <w:shd w:fill="F2F2F2" w:val="clear"/>
-            <w:tcMar>
-              <w:top w:type="dxa" w:w="60"/>
-              <w:left w:type="dxa" w:w="100"/>
-              <w:bottom w:type="dxa" w:w="60"/>
-              <w:right w:type="dxa" w:w="100"/>
-            </w:tcMar>
-          </w:tcPr>
-          <w:p>
-            <w:r>
-              <w:rPr>
-                <w:rFonts w:ascii="Arial" w:cs="Arial" w:eastAsia="Arial" w:hAnsi="Arial"/>
-                <w:b w:val="false"/>
-                <w:bCs w:val="false"/>
-                <w:color w:val="000000"/>
-                <w:sz w:val="18"/>
-                <w:szCs w:val="18"/>
-              </w:rPr>
-              <w:t xml:space="preserve">25 USD/user/mois. Accès GPT-4o, historique isolé, pas de réutilisation des données pour entraînement.</w:t>
-            </w:r>
-          </w:p>
-        </w:tc>
-        <w:tc>
-          <w:tcPr>
-            <w:tcW w:type="dxa" w:w="1800"/>
-            <w:tcBorders>
-              <w:top w:val="single" w:color="CCCCCC" w:sz="1"/>
-              <w:left w:val="single" w:color="CCCCCC" w:sz="1"/>
-              <w:bottom w:val="single" w:color="CCCCCC" w:sz="1"/>
-              <w:right w:val="single" w:color="CCCCCC" w:sz="1"/>
-            </w:tcBorders>
-            <w:shd w:fill="F2F2F2" w:val="clear"/>
-            <w:tcMar>
-              <w:top w:type="dxa" w:w="60"/>
-              <w:left w:type="dxa" w:w="100"/>
-              <w:bottom w:type="dxa" w:w="60"/>
-              <w:right w:type="dxa" w:w="100"/>
-            </w:tcMar>
-          </w:tcPr>
-          <w:p>
-            <w:r>
-              <w:rPr>
-                <w:rFonts w:ascii="Arial" w:cs="Arial" w:eastAsia="Arial" w:hAnsi="Arial"/>
-                <w:b w:val="false"/>
-                <w:bCs w:val="false"/>
-                <w:color w:val="000000"/>
-                <w:sz w:val="18"/>
-                <w:szCs w:val="18"/>
-              </w:rPr>
-              <w:t xml:space="preserve">~ 300 €/mois pour 12 users</w:t>
-            </w:r>
-          </w:p>
-        </w:tc>
-        <w:tc>
-          <w:tcPr>
-            <w:tcW w:type="dxa" w:w="1626"/>
-            <w:tcBorders>
-              <w:top w:val="single" w:color="CCCCCC" w:sz="1"/>
-              <w:left w:val="single" w:color="CCCCCC" w:sz="1"/>
-              <w:bottom w:val="single" w:color="CCCCCC" w:sz="1"/>
-              <w:right w:val="single" w:color="CCCCCC" w:sz="1"/>
-            </w:tcBorders>
-            <w:shd w:fill="F2F2F2" w:val="clear"/>
             <w:tcMar>
               <w:top w:type="dxa" w:w="60"/>
               <w:left w:type="dxa" w:w="100"/>
@@ -6539,7 +6287,7 @@
               <w:bottom w:val="single" w:color="CCCCCC" w:sz="1"/>
               <w:right w:val="single" w:color="CCCCCC" w:sz="1"/>
             </w:tcBorders>
-            <w:shd w:fill="FFFFFF" w:val="clear"/>
+            <w:shd w:fill="F2F2F2" w:val="clear"/>
             <w:tcMar>
               <w:top w:type="dxa" w:w="60"/>
               <w:left w:type="dxa" w:w="100"/>
@@ -6557,7 +6305,7 @@
                 <w:sz w:val="18"/>
                 <w:szCs w:val="18"/>
               </w:rPr>
-              <w:t xml:space="preserve">Option 4 – Claude Teams (min. 5 users)</w:t>
+              <w:t xml:space="preserve">Option 3 – Google Workspace + Gemini for Workspace</w:t>
             </w:r>
           </w:p>
         </w:tc>
@@ -6570,25 +6318,25 @@
               <w:bottom w:val="single" w:color="CCCCCC" w:sz="1"/>
               <w:right w:val="single" w:color="CCCCCC" w:sz="1"/>
             </w:tcBorders>
-            <w:shd w:fill="FFFFFF" w:val="clear"/>
-            <w:tcMar>
-              <w:top w:type="dxa" w:w="60"/>
-              <w:left w:type="dxa" w:w="100"/>
-              <w:bottom w:type="dxa" w:w="60"/>
-              <w:right w:type="dxa" w:w="100"/>
-            </w:tcMar>
-          </w:tcPr>
-          <w:p>
-            <w:r>
-              <w:rPr>
-                <w:rFonts w:ascii="Arial" w:cs="Arial" w:eastAsia="Arial" w:hAnsi="Arial"/>
-                <w:b w:val="false"/>
-                <w:bCs w:val="false"/>
-                <w:color w:val="000000"/>
-                <w:sz w:val="18"/>
-                <w:szCs w:val="18"/>
-              </w:rPr>
-              <w:t xml:space="preserve">25 €/user/mois. Mêmes avantages. Adapté si déploiement récurrent sur plusieurs sessions.</w:t>
+            <w:shd w:fill="F2F2F2" w:val="clear"/>
+            <w:tcMar>
+              <w:top w:type="dxa" w:w="60"/>
+              <w:left w:type="dxa" w:w="100"/>
+              <w:bottom w:type="dxa" w:w="60"/>
+              <w:right w:type="dxa" w:w="100"/>
+            </w:tcMar>
+          </w:tcPr>
+          <w:p>
+            <w:r>
+              <w:rPr>
+                <w:rFonts w:ascii="Arial" w:cs="Arial" w:eastAsia="Arial" w:hAnsi="Arial"/>
+                <w:b w:val="false"/>
+                <w:bCs w:val="false"/>
+                <w:color w:val="000000"/>
+                <w:sz w:val="18"/>
+                <w:szCs w:val="18"/>
+              </w:rPr>
+              <w:t xml:space="preserve">Licences Gemini for Workspace (tarif Education / entreprise négociable). Pertinent si le site dispose déjà d'un parc Google.</w:t>
             </w:r>
           </w:p>
         </w:tc>
@@ -6601,25 +6349,25 @@
               <w:bottom w:val="single" w:color="CCCCCC" w:sz="1"/>
               <w:right w:val="single" w:color="CCCCCC" w:sz="1"/>
             </w:tcBorders>
-            <w:shd w:fill="FFFFFF" w:val="clear"/>
-            <w:tcMar>
-              <w:top w:type="dxa" w:w="60"/>
-              <w:left w:type="dxa" w:w="100"/>
-              <w:bottom w:type="dxa" w:w="60"/>
-              <w:right w:type="dxa" w:w="100"/>
-            </w:tcMar>
-          </w:tcPr>
-          <w:p>
-            <w:r>
-              <w:rPr>
-                <w:rFonts w:ascii="Arial" w:cs="Arial" w:eastAsia="Arial" w:hAnsi="Arial"/>
-                <w:b w:val="false"/>
-                <w:bCs w:val="false"/>
-                <w:color w:val="000000"/>
-                <w:sz w:val="18"/>
-                <w:szCs w:val="18"/>
-              </w:rPr>
-              <w:t xml:space="preserve">~ 300 €/mois pour 12 users</w:t>
+            <w:shd w:fill="F2F2F2" w:val="clear"/>
+            <w:tcMar>
+              <w:top w:type="dxa" w:w="60"/>
+              <w:left w:type="dxa" w:w="100"/>
+              <w:bottom w:type="dxa" w:w="60"/>
+              <w:right w:type="dxa" w:w="100"/>
+            </w:tcMar>
+          </w:tcPr>
+          <w:p>
+            <w:r>
+              <w:rPr>
+                <w:rFonts w:ascii="Arial" w:cs="Arial" w:eastAsia="Arial" w:hAnsi="Arial"/>
+                <w:b w:val="false"/>
+                <w:bCs w:val="false"/>
+                <w:color w:val="000000"/>
+                <w:sz w:val="18"/>
+                <w:szCs w:val="18"/>
+              </w:rPr>
+              <w:t xml:space="preserve">Variable – à négocier selon accord cadre</w:t>
             </w:r>
           </w:p>
         </w:tc>
@@ -6632,7 +6380,7 @@
               <w:bottom w:val="single" w:color="CCCCCC" w:sz="1"/>
               <w:right w:val="single" w:color="CCCCCC" w:sz="1"/>
             </w:tcBorders>
-            <w:shd w:fill="FFFFFF" w:val="clear"/>
+            <w:shd w:fill="F2F2F2" w:val="clear"/>
             <w:tcMar>
               <w:top w:type="dxa" w:w="60"/>
               <w:left w:type="dxa" w:w="100"/>
@@ -6706,7 +6454,7 @@
                 <w:sz w:val="18"/>
                 <w:szCs w:val="18"/>
               </w:rPr>
-              <w:t xml:space="preserve">Recommandation pragmatique : pour une session d’initiation, l’Option 1 (comptes gratuits) couvre 80 % des ateliers. La valeur ajoutée des options premium est surtout perceptible pour des publics techniciens avancés ou des mises en situation sur des cas complexes.</w:t>
+              <w:t xml:space="preserve">Recommandation pragmatique : pour une session d'initiation, l'Option 1 (comptes gratuits Gemini / Claude) couvre 80 % des ateliers. La valeur ajoutée des options premium est surtout perceptible pour des publics techniciens avancés ou des mises en situation sur des cas complexes.</w:t>
             </w:r>
           </w:p>
         </w:tc>
@@ -6977,7 +6725,7 @@
                 <w:sz w:val="18"/>
                 <w:szCs w:val="18"/>
               </w:rPr>
-              <w:t xml:space="preserve">Abonnement ChatGPT Plus (formateur)</w:t>
+              <w:t xml:space="preserve">Abonnement Gemini Advanced (formateur)</w:t>
             </w:r>
           </w:p>
         </w:tc>
@@ -7167,7 +6915,7 @@
                 <w:sz w:val="18"/>
                 <w:szCs w:val="18"/>
               </w:rPr>
-              <w:t xml:space="preserve">Licences stagiaires – Options 3 ou 4 (12 users)</w:t>
+              <w:t xml:space="preserve">Licences stagiaires – Option 2 Claude Teams (12 users)</w:t>
             </w:r>
           </w:p>
         </w:tc>
@@ -7229,7 +6977,7 @@
                 <w:sz w:val="18"/>
                 <w:szCs w:val="18"/>
               </w:rPr>
-              <w:t xml:space="preserve">~ 300 €/session</w:t>
+              <w:t xml:space="preserve">~ 300 €/session</w:t>
             </w:r>
           </w:p>
         </w:tc>
@@ -7324,7 +7072,7 @@
                 <w:sz w:val="18"/>
                 <w:szCs w:val="18"/>
               </w:rPr>
-              <w:t xml:space="preserve">~ 15 €/session</w:t>
+              <w:t xml:space="preserve">~ 15 €/session</w:t>
             </w:r>
           </w:p>
         </w:tc>
@@ -7514,7 +7262,7 @@
                 <w:sz w:val="18"/>
                 <w:szCs w:val="18"/>
               </w:rPr>
-              <w:t xml:space="preserve">~ 360 €/session</w:t>
+              <w:t xml:space="preserve">~ 360 €/session</w:t>
             </w:r>
           </w:p>
         </w:tc>
@@ -7559,7 +7307,7 @@
           <w:sz w:val="20"/>
           <w:szCs w:val="20"/>
         </w:rPr>
-        <w:t xml:space="preserve">Ce scénario permet d’exécuter un LLM localement, sans connexion internet et sans coût d’abonnement récurrent. Il est particulièrement pertinent pour les formations en site industriel avec restrictions réseau, ou pour garantir la confidentialité absolue des données traitées.</w:t>
+        <w:t xml:space="preserve">Ce scénario permet d'exécuter un LLM localement, sans connexion internet et sans coût d'abonnement récurrent. Il est particulièrement pertinent pour les formations en site industriel avec restrictions réseau, ou pour garantir la confidentialité absolue des données traitées.</w:t>
       </w:r>
     </w:p>
     <w:p>
@@ -8227,7 +7975,7 @@
                 <w:sz w:val="18"/>
                 <w:szCs w:val="18"/>
               </w:rPr>
-              <w:t xml:space="preserve">GPU 16 Go VRAM (ex : RTX 4080)</w:t>
+              <w:t xml:space="preserve">GPU 16 Go VRAM (ex : RTX 4080)</w:t>
             </w:r>
           </w:p>
         </w:tc>
@@ -8384,7 +8132,7 @@
                 <w:sz w:val="18"/>
                 <w:szCs w:val="18"/>
               </w:rPr>
-              <w:t xml:space="preserve">GPU 24 Go VRAM (ex : RTX 4090)</w:t>
+              <w:t xml:space="preserve">GPU 24 Go VRAM (ex : RTX 4090)</w:t>
             </w:r>
           </w:p>
         </w:tc>
@@ -8628,7 +8376,7 @@
                 <w:sz w:val="18"/>
                 <w:szCs w:val="18"/>
               </w:rPr>
-              <w:t xml:space="preserve">Conclusion matériel : pour une salle de formation avec 1 serveur partagé, Llama 3.1 8B sur machine avec GPU RTX 3070 (8 Go VRAM) offre un rapport qualité/coût acceptable. Pour une qualité équivalente aux outils cloud grand public, un GPU 24 Go minimum est requis. Coût d’un serveur complet : 2 000 à 3 000 €.</w:t>
+              <w:t xml:space="preserve">Conclusion matériel : pour une salle de formation avec 1 serveur partagé, Llama 3.1 8B sur machine avec GPU RTX 3070 (8 Go VRAM) offre un rapport qualité/coût acceptable. Pour une qualité équivalente aux outils cloud grand public, un GPU 24 Go minimum est requis. Coût d'un serveur complet : 2 000 à 3 000 €.</w:t>
             </w:r>
           </w:p>
         </w:tc>
@@ -8866,7 +8614,7 @@
                 <w:sz w:val="18"/>
                 <w:szCs w:val="18"/>
               </w:rPr>
-              <w:t xml:space="preserve">1 500 – 2 500 € (serveur GPU)</w:t>
+              <w:t xml:space="preserve">1 500 – 2 500 € (serveur GPU)</w:t>
             </w:r>
           </w:p>
         </w:tc>
@@ -8930,7 +8678,7 @@
                 <w:sz w:val="18"/>
                 <w:szCs w:val="18"/>
               </w:rPr>
-              <w:t xml:space="preserve">Ollama installé sur le poste formateur pour les démonstrations. Les ateliers stagiaires utilisent les comptes cloud gratuits.</w:t>
+              <w:t xml:space="preserve">Ollama installé sur le poste formateur pour les démonstrations. Les ateliers stagiaires utilisent les comptes cloud gratuits (Gemini Free / Claude Free).</w:t>
             </w:r>
           </w:p>
         </w:tc>
@@ -9358,7 +9106,7 @@
                 <w:sz w:val="18"/>
                 <w:szCs w:val="18"/>
               </w:rPr>
-              <w:t xml:space="preserve">Interface web pour interagir avec Ollama (équivalent ChatGPT local)</w:t>
+              <w:t xml:space="preserve">Interface web pour interagir avec Ollama (équivalent interface chat locale)</w:t>
             </w:r>
           </w:p>
         </w:tc>
@@ -9453,7 +9201,7 @@
                 <w:sz w:val="18"/>
                 <w:szCs w:val="18"/>
               </w:rPr>
-              <w:t xml:space="preserve">Simplifie le déploiement d’Open WebUI</w:t>
+              <w:t xml:space="preserve">Simplifie le déploiement d'Open WebUI</w:t>
             </w:r>
           </w:p>
         </w:tc>
@@ -9548,7 +9296,7 @@
                 <w:sz w:val="18"/>
                 <w:szCs w:val="18"/>
               </w:rPr>
-              <w:t xml:space="preserve">Nécessaire pour les ateliers de scripting et d’analyse de données</w:t>
+              <w:t xml:space="preserve">Nécessaire pour les ateliers de scripting et d'analyse de données</w:t>
             </w:r>
           </w:p>
         </w:tc>
@@ -9724,7 +9472,7 @@
           <w:sz w:val="20"/>
           <w:szCs w:val="20"/>
         </w:rPr>
-        <w:t xml:space="preserve">Temps d’installation : </w:t>
+        <w:t xml:space="preserve">Temps d'installation : </w:t>
       </w:r>
       <w:r>
         <w:rPr>
@@ -9732,7 +9480,7 @@
           <w:sz w:val="20"/>
           <w:szCs w:val="20"/>
         </w:rPr>
-        <w:t xml:space="preserve">prévoir 2 à 4 heures pour configurer le serveur, télécharger les modèles (3 à 40 Go selon le modèle) et tester l’accès réseau depuis tous les postes stagiaires.</w:t>
+        <w:t xml:space="preserve">prévoir 2 à 4 heures pour configurer le serveur, télécharger les modèles (3 à 40 Go selon le modèle) et tester l'accès réseau depuis tous les postes stagiaires.</w:t>
       </w:r>
     </w:p>
     <w:p>
@@ -9760,7 +9508,7 @@
           <w:sz w:val="20"/>
           <w:szCs w:val="20"/>
         </w:rPr>
-        <w:t xml:space="preserve">le formateur ou un technicien informatique doit maîtriser l’installation en ligne de commande. Le guide est disponible dans les ressources existantes (Accomplish/01_Guide_Installation_Ollama).</w:t>
+        <w:t xml:space="preserve">le formateur ou un technicien informatique doit maîtriser l'installation en ligne de commande. Le guide est disponible dans les ressources existantes (Accomplish/01_Guide_Installation_Ollama).</w:t>
       </w:r>
     </w:p>
     <w:p>
@@ -9816,7 +9564,7 @@
           <w:sz w:val="20"/>
           <w:szCs w:val="20"/>
         </w:rPr>
-        <w:t xml:space="preserve">un LLM local de 7 à 8 milliards de paramètres est moins performant qu’un GPT-4o ou Claude Sonnet sur les tâches complexes. Cela peut être exploité pédagogiquement (illustration des limites) mais peut générer de la frustration sur les ateliers avancés.</w:t>
+        <w:t xml:space="preserve">un LLM local de 7 à 8 milliards de paramètres est moins performant que Claude Sonnet ou Gemini Pro sur les tâches complexes. Cela peut être exploité pédagogiquement (illustration des limites) mais peut générer de la frustration sur les ateliers avancés.</w:t>
       </w:r>
     </w:p>
     <w:p>
@@ -10016,7 +9764,7 @@
                 <w:sz w:val="18"/>
                 <w:szCs w:val="18"/>
               </w:rPr>
-              <w:t xml:space="preserve">1 500 – 2 500 € (investissement unique)</w:t>
+              <w:t xml:space="preserve">1 500 – 2 500 € (investissement unique)</w:t>
             </w:r>
           </w:p>
         </w:tc>
@@ -10336,7 +10084,7 @@
                 <w:sz w:val="18"/>
                 <w:szCs w:val="18"/>
               </w:rPr>
-              <w:t xml:space="preserve">1 500 – 2 500 € (amorti sur 3 à 4 ans, soit &lt; 50 €/mois)</w:t>
+              <w:t xml:space="preserve">1 500 – 2 500 € (amorti sur 3 à 4 ans, soit &lt; 50 €/mois)</w:t>
             </w:r>
           </w:p>
         </w:tc>
@@ -10586,7 +10334,7 @@
                 <w:sz w:val="18"/>
                 <w:szCs w:val="18"/>
               </w:rPr>
-              <w:t xml:space="preserve">1 500 – 2 500 € (matériel)</w:t>
+              <w:t xml:space="preserve">1 500 – 2 500 € (matériel)</w:t>
             </w:r>
           </w:p>
         </w:tc>
@@ -10745,7 +10493,7 @@
                 <w:sz w:val="18"/>
                 <w:szCs w:val="18"/>
               </w:rPr>
-              <w:t xml:space="preserve">État de l’art (GPT-4o, Claude Sonnet)</w:t>
+              <w:t xml:space="preserve">État de l'art (Claude Sonnet, Gemini Pro)</w:t>
             </w:r>
           </w:p>
         </w:tc>
@@ -10871,7 +10619,7 @@
                 <w:sz w:val="18"/>
                 <w:szCs w:val="18"/>
               </w:rPr>
-              <w:t xml:space="preserve">Complexe – technicien requis à l’installation</w:t>
+              <w:t xml:space="preserve">Complexe – technicien requis à l'installation</w:t>
             </w:r>
           </w:p>
         </w:tc>
@@ -10966,7 +10714,7 @@
                 <w:sz w:val="18"/>
                 <w:szCs w:val="18"/>
               </w:rPr>
-              <w:t xml:space="preserve">Données 100 % locales, zéro transfert</w:t>
+              <w:t xml:space="preserve">Données 100 % locales, zéro transfert</w:t>
             </w:r>
           </w:p>
         </w:tc>
@@ -11284,7 +11032,7 @@
                 <w:sz w:val="18"/>
                 <w:szCs w:val="18"/>
               </w:rPr>
-              <w:t xml:space="preserve">Représentation de l’état de l’art</w:t>
+              <w:t xml:space="preserve">Représentation de l'état de l'art</w:t>
             </w:r>
           </w:p>
         </w:tc>
@@ -11533,7 +11281,7 @@
                 <w:sz w:val="20"/>
                 <w:szCs w:val="20"/>
               </w:rPr>
-              <w:t xml:space="preserve">Le formateur souscrit à Claude Pro + ChatGPT Plus (42 €/mois). Les stagiaires utilisent des comptes Gemini ou ChatGPT gratuits. Cette configuration couvre 100 % des objectifs de la fiche AFPI pour un coût minimal. Déployable immédiatement, sans investissement matériel.</w:t>
+              <w:t xml:space="preserve">Le formateur souscrit à Claude Pro + Gemini Advanced (42 €/mois). Les stagiaires utilisent des comptes Gemini Free ou Claude Free. Cette configuration couvre 100 % des objectifs de la fiche AFPI pour un coût minimal. Déployable immédiatement, sans investissement matériel.</w:t>
             </w:r>
           </w:p>
           <w:p>
@@ -11565,7 +11313,7 @@
                 <w:sz w:val="20"/>
                 <w:szCs w:val="20"/>
               </w:rPr>
-              <w:t xml:space="preserve">Phase 2 (après 2 à 3 sessions) : évaluation de la montée en charge</w:t>
+              <w:t xml:space="preserve">Phase 2 (après 2 à 3 sessions) : évaluation de la montée en charge</w:t>
             </w:r>
           </w:p>
           <w:p>
@@ -11581,7 +11329,7 @@
                 <w:sz w:val="20"/>
                 <w:szCs w:val="20"/>
               </w:rPr>
-              <w:t xml:space="preserve">Si le volume de sessions le justifie, ou si des formations sont organisées en site industriel avec restrictions réseau : acquisition d’un serveur GPU (1 500 – 2 500 €) pour le Scénario B en complément. L’investissement devient rentable dès la 5e session environ.</w:t>
+              <w:t xml:space="preserve">Si le volume de sessions le justifie, ou si des formations sont organisées en site industriel avec restrictions réseau : acquisition d'un serveur GPU (1 500 – 2 500 €) pour le Scénario B en complément. L'investissement devient rentable dès la 5e session environ.</w:t>
             </w:r>
           </w:p>
         </w:tc>
@@ -11636,7 +11384,7 @@
           <w:sz w:val="20"/>
           <w:szCs w:val="20"/>
         </w:rPr>
-        <w:t xml:space="preserve">Le dépôt de ressources Cours-IA contient l’intégralité du matériel pédagogique nécessaire à l’animation. Aucun achat de contenu n’est requis.</w:t>
+        <w:t xml:space="preserve">Le dépôt de ressources Cours-IA contient l'intégralité du matériel pédagogique nécessaire à l'animation. Aucun achat de contenu n'est requis.</w:t>
       </w:r>
     </w:p>
     <w:p>
@@ -11916,7 +11664,7 @@
                 <w:sz w:val="18"/>
                 <w:szCs w:val="18"/>
               </w:rPr>
-              <w:t xml:space="preserve">3 ateliers HTML interactifs + corrigés formateur (1 700+ lignes)</w:t>
+              <w:t xml:space="preserve">3 ateliers HTML interactifs + corrigés formateur (1 700+ lignes)</w:t>
             </w:r>
           </w:p>
         </w:tc>
@@ -12011,7 +11759,7 @@
                 <w:sz w:val="18"/>
                 <w:szCs w:val="18"/>
               </w:rPr>
-              <w:t xml:space="preserve">6 activités HTML + guide formateur + vidéo « L’Anatomie des Biais »</w:t>
+              <w:t xml:space="preserve">6 activités HTML + guide formateur + vidéo « L'Anatomie des Biais »</w:t>
             </w:r>
           </w:p>
         </w:tc>
@@ -12137,7 +11885,7 @@
                 <w:sz w:val="18"/>
                 <w:szCs w:val="18"/>
               </w:rPr>
-              <w:t xml:space="preserve">Cas d’usage techniciens</w:t>
+              <w:t xml:space="preserve">Cas d'usage techniciens</w:t>
             </w:r>
           </w:p>
         </w:tc>
@@ -12296,7 +12044,7 @@
                 <w:sz w:val="18"/>
                 <w:szCs w:val="18"/>
               </w:rPr>
-              <w:t xml:space="preserve">Manuel élève NotebookLM + guide d’utilisation avancé</w:t>
+              <w:t xml:space="preserve">Manuel élève NotebookLM + guide d'utilisation avancé</w:t>
             </w:r>
           </w:p>
         </w:tc>
@@ -12422,7 +12170,7 @@
                 <w:sz w:val="18"/>
                 <w:szCs w:val="18"/>
               </w:rPr>
-              <w:t xml:space="preserve">Scénario B + cas d’usage métier</w:t>
+              <w:t xml:space="preserve">Scénario B + cas d'usage métier</w:t>
             </w:r>
           </w:p>
         </w:tc>

</xml_diff>